<commit_message>
Update Advanced PhD & Grant proposals to 30-month fast-track timeline (was 36 months)
</commit_message>
<xml_diff>
--- a/Grant_Project_Proposal_Advanced_Raj_Amritam.docx
+++ b/Grant_Project_Proposal_Advanced_Raj_Amritam.docx
@@ -316,7 +316,7 @@
               <w:rPr>
                 <w:sz w:val="20"/>
               </w:rPr>
-              <w:t>36 Months (3-Year Fast-Track Strategy)</w:t>
+              <w:t>30 Months (2.5-Year Fast-Track Strategy)</w:t>
             </w:r>
           </w:p>
         </w:tc>
@@ -660,7 +660,7 @@
         <w:jc w:val="both"/>
       </w:pPr>
       <w:r>
-        <w:t>This proposal presents a strategically integrated response designed for multi-year climate funding bodies seeking demonstrable community-level impact within compressed timelines. The core value proposition is the explicit dual-structure architecture bridging the persistent gap between academic computational research ("The Brain") and immediate, cost-effective on-ground community deployment ("The Body") within a single 36-month execution window. Unlike conventional academic projects (publications without operational outcomes) or development projects (infrastructure without scientific rigor), this initiative deliberately fuses both paradigms—producing simultaneously a validated hydro-spatial modeling framework (publishable in Q1 SCIE journals) AND a functioning early warning system protecting minimum 2,500 directly vulnerable households.</w:t>
+        <w:t>This proposal presents a strategically integrated response designed for multi-year climate funding bodies seeking demonstrable community-level impact within compressed timelines. The core value proposition is the explicit dual-structure architecture bridging the persistent gap between academic computational research ("The Brain") and immediate, cost-effective on-ground community deployment ("The Body") within a single 30-month execution window. Unlike conventional academic projects (publications without operational outcomes) or development projects (infrastructure without scientific rigor), this initiative deliberately fuses both paradigms—producing simultaneously a validated hydro-spatial modeling framework (publishable in Q1 SCIE journals) AND a functioning early warning system protecting minimum 2,500 directly vulnerable households.</w:t>
       </w:r>
     </w:p>
     <w:p>
@@ -680,7 +680,7 @@
         <w:jc w:val="both"/>
       </w:pPr>
       <w:r>
-        <w:t>This project targets the institutional sweet-spot where academic innovation meets deployment readiness: INR 28,50,000 over 36 months (~INR 1,140 per protected household) delivering a replicable, open-source template scalable across 13 districts of Uttarakhand and 25+ Himalayan districts of Himachal Pradesh, Sikkim, Arunachal Pradesh. The initiative directly serves the National Mission on Himalayan Studies (NMHS) priority areas, DST-NMSHE adaptation goals, and NAFCC implementation mandates while generating a pipeline of larger multilateral programs (GCF, ADB, GFDRR portfolios in INR 20-500 Crore range).</w:t>
+        <w:t>This project targets the institutional sweet-spot where academic innovation meets deployment readiness: INR 28,50,000 over 30 months (~INR 1,140 per protected household) delivering a replicable, open-source template scalable across 13 districts of Uttarakhand and 25+ Himalayan districts of Himachal Pradesh, Sikkim, Arunachal Pradesh. The initiative directly serves the National Mission on Himalayan Studies (NMHS) priority areas, DST-NMSHE adaptation goals, and NAFCC implementation mandates while generating a pipeline of larger multilateral programs (GCF, ADB, GFDRR portfolios in INR 20-500 Crore range).</w:t>
       </w:r>
     </w:p>
     <w:p>
@@ -3328,7 +3328,7 @@
               <w:rPr>
                 <w:sz w:val="20"/>
               </w:rPr>
-              <w:t>M18</w:t>
+              <w:t>M15</w:t>
             </w:r>
           </w:p>
         </w:tc>
@@ -6562,101 +6562,106 @@
           <w:rFonts w:ascii="Courier New" w:hAnsi="Courier New"/>
           <w:sz w:val="16"/>
         </w:rPr>
-        <w:br/>
-        <w:t>TASK / ACTIVITY               Y1Q1 Y1Q2 Y1Q3 Y1Q4 Y2Q1 Y2Q2 Y2Q3 Y2Q4 Y3Q1 Y3Q2 Y3Q3 Y3Q4</w:t>
-        <w:br/>
-        <w:t>═══════════════════════════════════════════════════════════════════════════════════════</w:t>
+        <w:t>TASK / ACTIVITY               Y1Q1 Y1Q2 Y1Q3 Y1Q4 Y2Q1 Y2Q2 Y2Q3 Y2Q4 Y3Q1 Y3Q2</w:t>
+        <w:br/>
+        <w:t>=====================================================================================</w:t>
+        <w:br/>
+        <w:t xml:space="preserve"> [30-MONTH FAST-TRACK PROJECT IMPLEMENTATION]</w:t>
+        <w:br/>
         <w:br/>
         <w:t>A. PROJECT INCEPTION</w:t>
         <w:br/>
-        <w:t xml:space="preserve">  A1. Site selection         ████ </w:t>
-        <w:br/>
-        <w:t xml:space="preserve">  A2. SDMA MoU               ████ </w:t>
-        <w:br/>
-        <w:t xml:space="preserve">  A3. Inception workshop     ████ </w:t>
-        <w:br/>
-        <w:br/>
-        <w:t xml:space="preserve">B. TASK 1: FVI ATLAS  </w:t>
-        <w:br/>
-        <w:t xml:space="preserve">  B1. Data acquisition       ████ ████ </w:t>
-        <w:br/>
-        <w:t xml:space="preserve">  B2. AHP expert panel            ████ ████ </w:t>
-        <w:br/>
-        <w:t xml:space="preserve">  B3. FVI computation                  ████ ████ </w:t>
-        <w:br/>
-        <w:t xml:space="preserve">  B4. Validation                            ████ ████ </w:t>
-        <w:br/>
-        <w:t xml:space="preserve">  B5. Web portal launch                           ████ </w:t>
+        <w:t xml:space="preserve">  A1. Site selection         ###</w:t>
+        <w:br/>
+        <w:t xml:space="preserve">  A2. SDMA MoU               ###</w:t>
+        <w:br/>
+        <w:t xml:space="preserve">  A3. Inception workshop     ###</w:t>
+        <w:br/>
+        <w:br/>
+        <w:t>B. TASK 1: FVI ATLAS</w:t>
+        <w:br/>
+        <w:t xml:space="preserve">  B1. Data acquisition       ###  ###</w:t>
+        <w:br/>
+        <w:t xml:space="preserve">  B2. AHP expert panel            ###  ###</w:t>
+        <w:br/>
+        <w:t xml:space="preserve">  B3. FVI computation                  ###  ###</w:t>
+        <w:br/>
+        <w:t xml:space="preserve">  B4. Validation                            ###</w:t>
+        <w:br/>
+        <w:t xml:space="preserve">  B5. Web portal launch                          ###</w:t>
         <w:br/>
         <w:br/>
         <w:t>C. TASK 2: NbS PILOT</w:t>
         <w:br/>
-        <w:t xml:space="preserve">  C1. Site MoU+VanPanchayat        ████ </w:t>
-        <w:br/>
-        <w:t xml:space="preserve">  C2. MGNREGA mobilization              ████ </w:t>
-        <w:br/>
-        <w:t xml:space="preserve">  C3. Plant nursery raising             ████ ████ </w:t>
-        <w:br/>
-        <w:t xml:space="preserve">  C4. Civil works (bunds)                    ████ ████ </w:t>
-        <w:br/>
-        <w:t xml:space="preserve">  C5. Plantation                                  ████ </w:t>
-        <w:br/>
-        <w:t xml:space="preserve">  C6. Monitoring (continuous)                     ████ ████ ████ ████ ████ ████</w:t>
+        <w:t xml:space="preserve">  C1. Site MoU+VanPanchayat       ###</w:t>
+        <w:br/>
+        <w:t xml:space="preserve">  C2. MGNREGA mobilization              ###</w:t>
+        <w:br/>
+        <w:t xml:space="preserve">  C3. Plant nursery raising             ###  ###</w:t>
+        <w:br/>
+        <w:t xml:space="preserve">  C4. Civil works (bunding)                  ###  ###</w:t>
+        <w:br/>
+        <w:t xml:space="preserve">  C5. Plantation                                  ###</w:t>
+        <w:br/>
+        <w:t xml:space="preserve">  C6. Monitoring (continuous)                     ###  ###  ###  ###  ###</w:t>
         <w:br/>
         <w:br/>
         <w:t>D. TASK 3: IoT EWS</w:t>
         <w:br/>
-        <w:t xml:space="preserve">  D1. Equipment procurement        ████ </w:t>
-        <w:br/>
-        <w:t xml:space="preserve">  D2. Sensor installation               ████ </w:t>
-        <w:br/>
-        <w:t xml:space="preserve">  D3. Server+threshold setup                 ████ </w:t>
-        <w:br/>
-        <w:t xml:space="preserve">  D4. Community sensitization                ████ ████ </w:t>
-        <w:br/>
-        <w:t xml:space="preserve">  D5. Drills (May 2026, 2027)                            ████      ████</w:t>
-        <w:br/>
-        <w:t xml:space="preserve">  D6. Drills (Aug 2026, 2027, 2028)                             ████      ████      ████</w:t>
-        <w:br/>
-        <w:br/>
-        <w:t>E. SHG TASK FORCE FORMATION</w:t>
-        <w:br/>
-        <w:t xml:space="preserve">  E1. Identification &amp; training              ████ ████ </w:t>
-        <w:br/>
-        <w:t xml:space="preserve">  E2. Refresher training                                    ████      ████</w:t>
+        <w:t xml:space="preserve">  D1. Equipment procurement        ###</w:t>
+        <w:br/>
+        <w:t xml:space="preserve">  D2. Sensor installation               ###</w:t>
+        <w:br/>
+        <w:t xml:space="preserve">  D3. Server+threshold setup                 ###</w:t>
+        <w:br/>
+        <w:t xml:space="preserve">  D4. Community sensitization                ###  ###</w:t>
+        <w:br/>
+        <w:t xml:space="preserve">  D5. Drill 1 (May 2026)                            ###</w:t>
+        <w:br/>
+        <w:t xml:space="preserve">  D6. Drill 2 (Aug 2026)                                 ###</w:t>
+        <w:br/>
+        <w:t xml:space="preserve">  D7. Drill 3 (May 2027)                                            ###</w:t>
+        <w:br/>
+        <w:br/>
+        <w:t>E. SHG TASK FORCE</w:t>
+        <w:br/>
+        <w:t xml:space="preserve">  E1. Identification + training              ###  ###</w:t>
+        <w:br/>
+        <w:t xml:space="preserve">  E2. Refresher training                                    ###</w:t>
         <w:br/>
         <w:br/>
         <w:t>F. DDMP INTEGRATION</w:t>
         <w:br/>
-        <w:t xml:space="preserve">  F1. Annexure drafting                                ████ ████ </w:t>
-        <w:br/>
-        <w:t xml:space="preserve">  F2. Stakeholder workshops                                 ████ ████ </w:t>
-        <w:br/>
-        <w:t xml:space="preserve">  F3. Administrative order pursuit                                    ████ ████</w:t>
+        <w:t xml:space="preserve">  F1. Annexure drafting                                ###  ###</w:t>
+        <w:br/>
+        <w:t xml:space="preserve">  F2. Stakeholder workshops                                 ###  ###</w:t>
+        <w:br/>
+        <w:t xml:space="preserve">  F3. Administrative order pursuit                                    ###</w:t>
         <w:br/>
         <w:br/>
         <w:t>G. M&amp;E</w:t>
         <w:br/>
-        <w:t xml:space="preserve">  G1. Quarterly progress reviews ░░░░ ░░░░ ░░░░ ░░░░ ░░░░ ░░░░ ░░░░ ░░░░ ░░░░ ░░░░ ░░░░ ░░░░</w:t>
-        <w:br/>
-        <w:t xml:space="preserve">  G2. Mid-term evaluation                                  ●(M18)</w:t>
-        <w:br/>
-        <w:t xml:space="preserve">  G3. End-term evaluation                                                          ●(M36)</w:t>
+        <w:t xml:space="preserve">  G1. Quarterly progress reviews ...  ...  ...  ...  ...  ...  ...  ...  ...  ...</w:t>
+        <w:br/>
+        <w:t xml:space="preserve">  G2. Mid-term evaluation                                  *(M15)</w:t>
+        <w:br/>
+        <w:t xml:space="preserve">  G3. End-term evaluation                                                   *(M30)</w:t>
         <w:br/>
         <w:br/>
         <w:t>H. PUBLICATIONS</w:t>
         <w:br/>
-        <w:t xml:space="preserve">  H1. Paper 1 (Review)            ████ ████ ████ ●Submit M12</w:t>
-        <w:br/>
-        <w:t xml:space="preserve">  H2. Paper 2 (FVI)                          ░░░░ ████ ████ ●Submit M18</w:t>
-        <w:br/>
-        <w:t xml:space="preserve">  H3. Paper 3 (Hydrology)                                  ░░░░ ████ ●Submit M27</w:t>
-        <w:br/>
-        <w:t xml:space="preserve">  H4. Paper 4 (Economics)                                            ░░░░ ████ ●Submit M33</w:t>
-        <w:br/>
-        <w:br/>
-        <w:t xml:space="preserve">  Legend: ████ Active   ░░░░ Background   ● Milestone</w:t>
-        <w:br/>
+        <w:t xml:space="preserve">  H1. Paper 1 (Review)           ###  ###  *Submit M9</w:t>
+        <w:br/>
+        <w:t xml:space="preserve">  H2. Paper 2 (FVI)                          ...  ###  *Submit M15</w:t>
+        <w:br/>
+        <w:t xml:space="preserve">  H3. Paper 3 (Hydrology)                                  ...  *Submit M22</w:t>
+        <w:br/>
+        <w:t xml:space="preserve">  H4. Paper 4 (Economics)                                            *Submit M27</w:t>
+        <w:br/>
+        <w:br/>
+        <w:t xml:space="preserve">  Legend: ### Active   ... Background   * Milestone</w:t>
+        <w:br/>
+        <w:t xml:space="preserve">  TOTAL DURATION: 30 MONTHS (Accelerated Fast-Track)</w:t>
       </w:r>
     </w:p>
     <w:p>
@@ -7884,7 +7889,7 @@
           <w:i/>
           <w:sz w:val="20"/>
         </w:rPr>
-        <w:t>TABLE 9.1: Comprehensive Project Budget — 36 Months</w:t>
+        <w:t>TABLE 9.1: Comprehensive Project Budget — 30 Months</w:t>
       </w:r>
     </w:p>
     <w:tbl>
@@ -8118,7 +8123,7 @@
               <w:rPr>
                 <w:sz w:val="20"/>
               </w:rPr>
-              <w:t>IoT River-Level Sensors (3 × 75K)</w:t>
+              <w:t>IoT River-Level Sensors (3 x 75K)</w:t>
             </w:r>
           </w:p>
         </w:tc>
@@ -8183,7 +8188,7 @@
               <w:rPr>
                 <w:sz w:val="20"/>
               </w:rPr>
-              <w:t>One-time procurement</w:t>
+              <w:t>One-time</w:t>
             </w:r>
           </w:p>
         </w:tc>
@@ -8276,7 +8281,7 @@
               <w:rPr>
                 <w:sz w:val="20"/>
               </w:rPr>
-              <w:t>Single AWS unit</w:t>
+              <w:t>Single AWS</w:t>
             </w:r>
           </w:p>
         </w:tc>
@@ -8369,7 +8374,7 @@
               <w:rPr>
                 <w:sz w:val="20"/>
               </w:rPr>
-              <w:t>Hydro modeling needs</w:t>
+              <w:t>Hydro modeling</w:t>
             </w:r>
           </w:p>
         </w:tc>
@@ -8423,7 +8428,7 @@
               <w:rPr>
                 <w:sz w:val="20"/>
               </w:rPr>
-              <w:t>2,00,000</w:t>
+              <w:t>2,50,000</w:t>
             </w:r>
           </w:p>
         </w:tc>
@@ -8436,7 +8441,7 @@
               <w:rPr>
                 <w:sz w:val="20"/>
               </w:rPr>
-              <w:t>5,50,000</w:t>
+              <w:t>5,00,000</w:t>
             </w:r>
           </w:p>
         </w:tc>
@@ -8462,7 +8467,7 @@
               <w:rPr>
                 <w:sz w:val="20"/>
               </w:rPr>
-              <w:t>Year 2 deployment heavy</w:t>
+              <w:t>Year 2 heavy</w:t>
             </w:r>
           </w:p>
         </w:tc>
@@ -8555,7 +8560,7 @@
               <w:rPr>
                 <w:sz w:val="20"/>
               </w:rPr>
-              <w:t>NbS pilot Year 2</w:t>
+              <w:t>NbS Year 2</w:t>
             </w:r>
           </w:p>
         </w:tc>
@@ -8609,7 +8614,7 @@
               <w:rPr>
                 <w:sz w:val="20"/>
               </w:rPr>
-              <w:t>50,000</w:t>
+              <w:t>60,000</w:t>
             </w:r>
           </w:p>
         </w:tc>
@@ -8635,7 +8640,7 @@
               <w:rPr>
                 <w:sz w:val="20"/>
               </w:rPr>
-              <w:t>40,000</w:t>
+              <w:t>30,000</w:t>
             </w:r>
           </w:p>
         </w:tc>
@@ -8648,7 +8653,7 @@
               <w:rPr>
                 <w:sz w:val="20"/>
               </w:rPr>
-              <w:t>Continuous engagement</w:t>
+              <w:t>Continuous</w:t>
             </w:r>
           </w:p>
         </w:tc>
@@ -8676,7 +8681,7 @@
               <w:rPr>
                 <w:sz w:val="20"/>
               </w:rPr>
-              <w:t>API server hosting + IVR (36 months)</w:t>
+              <w:t>API server + IVR (30 months)</w:t>
             </w:r>
           </w:p>
         </w:tc>
@@ -8702,7 +8707,7 @@
               <w:rPr>
                 <w:sz w:val="20"/>
               </w:rPr>
-              <w:t>60,000</w:t>
+              <w:t>72,000</w:t>
             </w:r>
           </w:p>
         </w:tc>
@@ -8715,7 +8720,7 @@
               <w:rPr>
                 <w:sz w:val="20"/>
               </w:rPr>
-              <w:t>60,000</w:t>
+              <w:t>72,000</w:t>
             </w:r>
           </w:p>
         </w:tc>
@@ -8728,7 +8733,7 @@
               <w:rPr>
                 <w:sz w:val="20"/>
               </w:rPr>
-              <w:t>60,000</w:t>
+              <w:t>36,000</w:t>
             </w:r>
           </w:p>
         </w:tc>
@@ -8741,7 +8746,7 @@
               <w:rPr>
                 <w:sz w:val="20"/>
               </w:rPr>
-              <w:t>Ongoing infrastructure</w:t>
+              <w:t>Ongoing</w:t>
             </w:r>
           </w:p>
         </w:tc>
@@ -8834,7 +8839,7 @@
               <w:rPr>
                 <w:sz w:val="20"/>
               </w:rPr>
-              <w:t>GEE/AWS during analysis</w:t>
+              <w:t>GEE/AWS</w:t>
             </w:r>
           </w:p>
         </w:tc>
@@ -8888,7 +8893,7 @@
               <w:rPr>
                 <w:sz w:val="20"/>
               </w:rPr>
-              <w:t>50,000</w:t>
+              <w:t>60,000</w:t>
             </w:r>
           </w:p>
         </w:tc>
@@ -8901,7 +8906,7 @@
               <w:rPr>
                 <w:sz w:val="20"/>
               </w:rPr>
-              <w:t>50,000</w:t>
+              <w:t>40,000</w:t>
             </w:r>
           </w:p>
         </w:tc>
@@ -8927,7 +8932,7 @@
               <w:rPr>
                 <w:sz w:val="20"/>
               </w:rPr>
-              <w:t>Infiltrometers, traps</w:t>
+              <w:t>Infiltrometers</w:t>
             </w:r>
           </w:p>
         </w:tc>
@@ -8981,7 +8986,7 @@
               <w:rPr>
                 <w:sz w:val="20"/>
               </w:rPr>
-              <w:t>-</w:t>
+              <w:t>18,000</w:t>
             </w:r>
           </w:p>
         </w:tc>
@@ -8994,7 +8999,7 @@
               <w:rPr>
                 <w:sz w:val="20"/>
               </w:rPr>
-              <w:t>1,00,000</w:t>
+              <w:t>48,000</w:t>
             </w:r>
           </w:p>
         </w:tc>
@@ -9007,7 +9012,7 @@
               <w:rPr>
                 <w:sz w:val="20"/>
               </w:rPr>
-              <w:t>-</w:t>
+              <w:t>34,000</w:t>
             </w:r>
           </w:p>
         </w:tc>
@@ -9020,7 +9025,7 @@
               <w:rPr>
                 <w:sz w:val="20"/>
               </w:rPr>
-              <w:t>Bunding/check structures</w:t>
+              <w:t>Structures</w:t>
             </w:r>
           </w:p>
         </w:tc>
@@ -9074,7 +9079,7 @@
               <w:rPr>
                 <w:sz w:val="20"/>
               </w:rPr>
-              <w:t>4,32,000</w:t>
+              <w:t>5,16,000</w:t>
             </w:r>
           </w:p>
         </w:tc>
@@ -9087,7 +9092,7 @@
               <w:rPr>
                 <w:sz w:val="20"/>
               </w:rPr>
-              <w:t>4,32,000</w:t>
+              <w:t>5,16,000</w:t>
             </w:r>
           </w:p>
         </w:tc>
@@ -9100,7 +9105,7 @@
               <w:rPr>
                 <w:sz w:val="20"/>
               </w:rPr>
-              <w:t>4,36,000</w:t>
+              <w:t>2,68,000</w:t>
             </w:r>
           </w:p>
         </w:tc>
@@ -9113,7 +9118,7 @@
               <w:rPr>
                 <w:sz w:val="20"/>
               </w:rPr>
-              <w:t>Largest single category</w:t>
+              <w:t>Largest (30mo)</w:t>
             </w:r>
           </w:p>
         </w:tc>
@@ -9141,7 +9146,7 @@
               <w:rPr>
                 <w:sz w:val="20"/>
               </w:rPr>
-              <w:t>JRF/SRF Fellowship (₹35K × 36mo)</w:t>
+              <w:t>JRF/SRF Fellowship (Rs.35K x 30mo)</w:t>
             </w:r>
           </w:p>
         </w:tc>
@@ -9154,7 +9159,7 @@
               <w:rPr>
                 <w:sz w:val="20"/>
               </w:rPr>
-              <w:t>12,60,000</w:t>
+              <w:t>10,50,000</w:t>
             </w:r>
           </w:p>
         </w:tc>
@@ -9193,7 +9198,7 @@
               <w:rPr>
                 <w:sz w:val="20"/>
               </w:rPr>
-              <w:t>4,20,000</w:t>
+              <w:t>2,10,000</w:t>
             </w:r>
           </w:p>
         </w:tc>
@@ -9299,7 +9304,7 @@
               <w:rPr>
                 <w:sz w:val="20"/>
               </w:rPr>
-              <w:t>Monsoon support</w:t>
+              <w:t>Monsoon</w:t>
             </w:r>
           </w:p>
         </w:tc>
@@ -9353,7 +9358,7 @@
               <w:rPr>
                 <w:sz w:val="20"/>
               </w:rPr>
-              <w:t>83,000</w:t>
+              <w:t>1,00,000</w:t>
             </w:r>
           </w:p>
         </w:tc>
@@ -9366,7 +9371,7 @@
               <w:rPr>
                 <w:sz w:val="20"/>
               </w:rPr>
-              <w:t>83,000</w:t>
+              <w:t>1,00,000</w:t>
             </w:r>
           </w:p>
         </w:tc>
@@ -9379,7 +9384,7 @@
               <w:rPr>
                 <w:sz w:val="20"/>
               </w:rPr>
-              <w:t>84,000</w:t>
+              <w:t>50,000</w:t>
             </w:r>
           </w:p>
         </w:tc>
@@ -9446,7 +9451,7 @@
               <w:rPr>
                 <w:sz w:val="20"/>
               </w:rPr>
-              <w:t>40,000</w:t>
+              <w:t>48,000</w:t>
             </w:r>
           </w:p>
         </w:tc>
@@ -9459,7 +9464,7 @@
               <w:rPr>
                 <w:sz w:val="20"/>
               </w:rPr>
-              <w:t>40,000</w:t>
+              <w:t>48,000</w:t>
             </w:r>
           </w:p>
         </w:tc>
@@ -9472,7 +9477,7 @@
               <w:rPr>
                 <w:sz w:val="20"/>
               </w:rPr>
-              <w:t>40,000</w:t>
+              <w:t>24,000</w:t>
             </w:r>
           </w:p>
         </w:tc>
@@ -9578,7 +9583,7 @@
               <w:rPr>
                 <w:sz w:val="20"/>
               </w:rPr>
-              <w:t>Y2-Y3 dissemination</w:t>
+              <w:t>Y2-Y3</w:t>
             </w:r>
           </w:p>
         </w:tc>
@@ -9724,7 +9729,7 @@
               <w:rPr>
                 <w:sz w:val="20"/>
               </w:rPr>
-              <w:t>11,65,000</w:t>
+              <w:t>13,16,000</w:t>
             </w:r>
           </w:p>
         </w:tc>
@@ -9737,7 +9742,7 @@
               <w:rPr>
                 <w:sz w:val="20"/>
               </w:rPr>
-              <w:t>10,65,000</w:t>
+              <w:t>11,16,000</w:t>
             </w:r>
           </w:p>
         </w:tc>
@@ -9750,7 +9755,7 @@
               <w:rPr>
                 <w:sz w:val="20"/>
               </w:rPr>
-              <w:t>6,20,000</w:t>
+              <w:t>4,18,000</w:t>
             </w:r>
           </w:p>
         </w:tc>

</xml_diff>